<commit_message>
更正 CVE-2019-8605 的修复版本为 iOS 12.4.1
三份报告中该漏洞的修复版本原写为 iOS 12.3 / 12.4，与 Apple 通告不符：
Apple 于 2019 年 8 月以 iOS 12.4.1 紧急更新修复这枚已被在野利用的 WebKit
缺陷。同时补充 CVE-2019-8554（JavaScriptCore 类型混淆，iOS 12.1.4 修复）
作为 2019 年初水坑利用链的 WebKit 入口，并对 Apple 通告未逐条定性缺陷类别
的案例增加说明，避免把公开分析结论当作官方定性表述。
</commit_message>
<xml_diff>
--- a/iOS WebKit远程代码执行漏洞分析报告.docx
+++ b/iOS WebKit远程代码执行漏洞分析报告.docx
@@ -516,7 +516,7 @@
         <w:rPr>
           <w:noProof/>
         </w:rPr>
-        <w:instrText xml:space="preserve"> PAGEREF _Toc242179599 \h </w:instrText>
+        <w:instrText xml:space="preserve"> PAGEREF _Toc242180230 \h </w:instrText>
       </w:r>
       <w:r>
         <w:rPr>
@@ -583,7 +583,7 @@
         <w:rPr>
           <w:noProof/>
         </w:rPr>
-        <w:instrText xml:space="preserve"> PAGEREF _Toc242179600 \h </w:instrText>
+        <w:instrText xml:space="preserve"> PAGEREF _Toc242180231 \h </w:instrText>
       </w:r>
       <w:r>
         <w:rPr>
@@ -656,7 +656,7 @@
         <w:rPr>
           <w:noProof/>
         </w:rPr>
-        <w:instrText xml:space="preserve"> PAGEREF _Toc242179601 \h </w:instrText>
+        <w:instrText xml:space="preserve"> PAGEREF _Toc242180232 \h </w:instrText>
       </w:r>
       <w:r>
         <w:rPr>
@@ -729,7 +729,7 @@
         <w:rPr>
           <w:noProof/>
         </w:rPr>
-        <w:instrText xml:space="preserve"> PAGEREF _Toc242179602 \h </w:instrText>
+        <w:instrText xml:space="preserve"> PAGEREF _Toc242180233 \h </w:instrText>
       </w:r>
       <w:r>
         <w:rPr>
@@ -808,7 +808,7 @@
         <w:rPr>
           <w:noProof/>
         </w:rPr>
-        <w:instrText xml:space="preserve"> PAGEREF _Toc242179603 \h </w:instrText>
+        <w:instrText xml:space="preserve"> PAGEREF _Toc242180234 \h </w:instrText>
       </w:r>
       <w:r>
         <w:rPr>
@@ -875,7 +875,7 @@
         <w:rPr>
           <w:noProof/>
         </w:rPr>
-        <w:instrText xml:space="preserve"> PAGEREF _Toc242179604 \h </w:instrText>
+        <w:instrText xml:space="preserve"> PAGEREF _Toc242180235 \h </w:instrText>
       </w:r>
       <w:r>
         <w:rPr>
@@ -942,7 +942,7 @@
         <w:rPr>
           <w:noProof/>
         </w:rPr>
-        <w:instrText xml:space="preserve"> PAGEREF _Toc242179605 \h </w:instrText>
+        <w:instrText xml:space="preserve"> PAGEREF _Toc242180236 \h </w:instrText>
       </w:r>
       <w:r>
         <w:rPr>
@@ -1015,7 +1015,7 @@
         <w:rPr>
           <w:noProof/>
         </w:rPr>
-        <w:instrText xml:space="preserve"> PAGEREF _Toc242179606 \h </w:instrText>
+        <w:instrText xml:space="preserve"> PAGEREF _Toc242180237 \h </w:instrText>
       </w:r>
       <w:r>
         <w:rPr>
@@ -1094,7 +1094,7 @@
         <w:rPr>
           <w:noProof/>
         </w:rPr>
-        <w:instrText xml:space="preserve"> PAGEREF _Toc242179607 \h </w:instrText>
+        <w:instrText xml:space="preserve"> PAGEREF _Toc242180238 \h </w:instrText>
       </w:r>
       <w:r>
         <w:rPr>
@@ -1161,7 +1161,7 @@
         <w:rPr>
           <w:noProof/>
         </w:rPr>
-        <w:instrText xml:space="preserve"> PAGEREF _Toc242179608 \h </w:instrText>
+        <w:instrText xml:space="preserve"> PAGEREF _Toc242180239 \h </w:instrText>
       </w:r>
       <w:r>
         <w:rPr>
@@ -1240,7 +1240,7 @@
         <w:rPr>
           <w:noProof/>
         </w:rPr>
-        <w:instrText xml:space="preserve"> PAGEREF _Toc242179609 \h </w:instrText>
+        <w:instrText xml:space="preserve"> PAGEREF _Toc242180240 \h </w:instrText>
       </w:r>
       <w:r>
         <w:rPr>
@@ -1319,7 +1319,7 @@
         <w:rPr>
           <w:noProof/>
         </w:rPr>
-        <w:instrText xml:space="preserve"> PAGEREF _Toc242179610 \h </w:instrText>
+        <w:instrText xml:space="preserve"> PAGEREF _Toc242180241 \h </w:instrText>
       </w:r>
       <w:r>
         <w:rPr>
@@ -1386,7 +1386,7 @@
         <w:rPr>
           <w:noProof/>
         </w:rPr>
-        <w:instrText xml:space="preserve"> PAGEREF _Toc242179611 \h </w:instrText>
+        <w:instrText xml:space="preserve"> PAGEREF _Toc242180242 \h </w:instrText>
       </w:r>
       <w:r>
         <w:rPr>
@@ -1453,7 +1453,7 @@
         <w:rPr>
           <w:noProof/>
         </w:rPr>
-        <w:instrText xml:space="preserve"> PAGEREF _Toc242179612 \h </w:instrText>
+        <w:instrText xml:space="preserve"> PAGEREF _Toc242180243 \h </w:instrText>
       </w:r>
       <w:r>
         <w:rPr>
@@ -1470,7 +1470,7 @@
         <w:rPr>
           <w:noProof/>
         </w:rPr>
-        <w:t>8</w:t>
+        <w:t>9</w:t>
       </w:r>
       <w:r>
         <w:rPr>
@@ -1544,7 +1544,7 @@
         <w:rPr>
           <w:noProof/>
         </w:rPr>
-        <w:instrText xml:space="preserve"> PAGEREF _Toc242179613 \h </w:instrText>
+        <w:instrText xml:space="preserve"> PAGEREF _Toc242180244 \h </w:instrText>
       </w:r>
       <w:r>
         <w:rPr>
@@ -1611,7 +1611,7 @@
         <w:rPr>
           <w:noProof/>
         </w:rPr>
-        <w:instrText xml:space="preserve"> PAGEREF _Toc242179614 \h </w:instrText>
+        <w:instrText xml:space="preserve"> PAGEREF _Toc242180245 \h </w:instrText>
       </w:r>
       <w:r>
         <w:rPr>
@@ -1678,7 +1678,7 @@
         <w:rPr>
           <w:noProof/>
         </w:rPr>
-        <w:instrText xml:space="preserve"> PAGEREF _Toc242179615 \h </w:instrText>
+        <w:instrText xml:space="preserve"> PAGEREF _Toc242180246 \h </w:instrText>
       </w:r>
       <w:r>
         <w:rPr>
@@ -1751,7 +1751,7 @@
         <w:rPr>
           <w:noProof/>
         </w:rPr>
-        <w:instrText xml:space="preserve"> PAGEREF _Toc242179616 \h </w:instrText>
+        <w:instrText xml:space="preserve"> PAGEREF _Toc242180247 \h </w:instrText>
       </w:r>
       <w:r>
         <w:rPr>
@@ -1818,7 +1818,7 @@
         <w:rPr>
           <w:noProof/>
         </w:rPr>
-        <w:instrText xml:space="preserve"> PAGEREF _Toc242179617 \h </w:instrText>
+        <w:instrText xml:space="preserve"> PAGEREF _Toc242180248 \h </w:instrText>
       </w:r>
       <w:r>
         <w:rPr>
@@ -1885,7 +1885,7 @@
         <w:rPr>
           <w:noProof/>
         </w:rPr>
-        <w:instrText xml:space="preserve"> PAGEREF _Toc242179618 \h </w:instrText>
+        <w:instrText xml:space="preserve"> PAGEREF _Toc242180249 \h </w:instrText>
       </w:r>
       <w:r>
         <w:rPr>
@@ -1952,7 +1952,7 @@
         <w:rPr>
           <w:noProof/>
         </w:rPr>
-        <w:instrText xml:space="preserve"> PAGEREF _Toc242179619 \h </w:instrText>
+        <w:instrText xml:space="preserve"> PAGEREF _Toc242180250 \h </w:instrText>
       </w:r>
       <w:r>
         <w:rPr>
@@ -2013,7 +2013,7 @@
         <w:rPr>
           <w:noProof/>
         </w:rPr>
-        <w:instrText xml:space="preserve"> PAGEREF _Toc242179620 \h </w:instrText>
+        <w:instrText xml:space="preserve"> PAGEREF _Toc242180251 \h </w:instrText>
       </w:r>
       <w:r>
         <w:rPr>
@@ -2122,7 +2122,7 @@
         <w:rPr>
           <w:noProof/>
         </w:rPr>
-        <w:instrText xml:space="preserve"> PAGEREF _Toc242179621 \h </w:instrText>
+        <w:instrText xml:space="preserve"> PAGEREF _Toc242180252 \h </w:instrText>
       </w:r>
       <w:r>
         <w:rPr>
@@ -2189,7 +2189,7 @@
         <w:rPr>
           <w:noProof/>
         </w:rPr>
-        <w:instrText xml:space="preserve"> PAGEREF _Toc242179622 \h </w:instrText>
+        <w:instrText xml:space="preserve"> PAGEREF _Toc242180253 \h </w:instrText>
       </w:r>
       <w:r>
         <w:rPr>
@@ -2256,7 +2256,7 @@
         <w:rPr>
           <w:noProof/>
         </w:rPr>
-        <w:instrText xml:space="preserve"> PAGEREF _Toc242179623 \h </w:instrText>
+        <w:instrText xml:space="preserve"> PAGEREF _Toc242180254 \h </w:instrText>
       </w:r>
       <w:r>
         <w:rPr>
@@ -2317,7 +2317,7 @@
         <w:rPr>
           <w:noProof/>
         </w:rPr>
-        <w:instrText xml:space="preserve"> PAGEREF _Toc242179624 \h </w:instrText>
+        <w:instrText xml:space="preserve"> PAGEREF _Toc242180255 \h </w:instrText>
       </w:r>
       <w:r>
         <w:rPr>
@@ -2384,7 +2384,7 @@
         <w:rPr>
           <w:noProof/>
         </w:rPr>
-        <w:instrText xml:space="preserve"> PAGEREF _Toc242179625 \h </w:instrText>
+        <w:instrText xml:space="preserve"> PAGEREF _Toc242180256 \h </w:instrText>
       </w:r>
       <w:r>
         <w:rPr>
@@ -2451,7 +2451,7 @@
         <w:rPr>
           <w:noProof/>
         </w:rPr>
-        <w:instrText xml:space="preserve"> PAGEREF _Toc242179626 \h </w:instrText>
+        <w:instrText xml:space="preserve"> PAGEREF _Toc242180257 \h </w:instrText>
       </w:r>
       <w:r>
         <w:rPr>
@@ -2518,7 +2518,7 @@
         <w:rPr>
           <w:noProof/>
         </w:rPr>
-        <w:instrText xml:space="preserve"> PAGEREF _Toc242179627 \h </w:instrText>
+        <w:instrText xml:space="preserve"> PAGEREF _Toc242180258 \h </w:instrText>
       </w:r>
       <w:r>
         <w:rPr>
@@ -2580,7 +2580,7 @@
         <w:rPr>
           <w:noProof/>
         </w:rPr>
-        <w:instrText xml:space="preserve"> PAGEREF _Toc242179628 \h </w:instrText>
+        <w:instrText xml:space="preserve"> PAGEREF _Toc242180259 \h </w:instrText>
       </w:r>
       <w:r>
         <w:rPr>
@@ -2647,7 +2647,7 @@
         <w:rPr>
           <w:noProof/>
         </w:rPr>
-        <w:instrText xml:space="preserve"> PAGEREF _Toc242179629 \h </w:instrText>
+        <w:instrText xml:space="preserve"> PAGEREF _Toc242180260 \h </w:instrText>
       </w:r>
       <w:r>
         <w:rPr>
@@ -2726,7 +2726,7 @@
         <w:rPr>
           <w:noProof/>
         </w:rPr>
-        <w:instrText xml:space="preserve"> PAGEREF _Toc242179630 \h </w:instrText>
+        <w:instrText xml:space="preserve"> PAGEREF _Toc242180261 \h </w:instrText>
       </w:r>
       <w:r>
         <w:rPr>
@@ -2793,7 +2793,7 @@
         <w:rPr>
           <w:noProof/>
         </w:rPr>
-        <w:instrText xml:space="preserve"> PAGEREF _Toc242179631 \h </w:instrText>
+        <w:instrText xml:space="preserve"> PAGEREF _Toc242180262 \h </w:instrText>
       </w:r>
       <w:r>
         <w:rPr>
@@ -2860,7 +2860,7 @@
         <w:rPr>
           <w:noProof/>
         </w:rPr>
-        <w:instrText xml:space="preserve"> PAGEREF _Toc242179632 \h </w:instrText>
+        <w:instrText xml:space="preserve"> PAGEREF _Toc242180263 \h </w:instrText>
       </w:r>
       <w:r>
         <w:rPr>
@@ -2921,7 +2921,7 @@
         <w:rPr>
           <w:noProof/>
         </w:rPr>
-        <w:instrText xml:space="preserve"> PAGEREF _Toc242179633 \h </w:instrText>
+        <w:instrText xml:space="preserve"> PAGEREF _Toc242180264 \h </w:instrText>
       </w:r>
       <w:r>
         <w:rPr>
@@ -2982,7 +2982,7 @@
         <w:rPr>
           <w:noProof/>
         </w:rPr>
-        <w:instrText xml:space="preserve"> PAGEREF _Toc242179634 \h </w:instrText>
+        <w:instrText xml:space="preserve"> PAGEREF _Toc242180265 \h </w:instrText>
       </w:r>
       <w:r>
         <w:rPr>
@@ -3055,7 +3055,7 @@
         <w:rPr>
           <w:noProof/>
         </w:rPr>
-        <w:instrText xml:space="preserve"> PAGEREF _Toc242179635 \h </w:instrText>
+        <w:instrText xml:space="preserve"> PAGEREF _Toc242180266 \h </w:instrText>
       </w:r>
       <w:r>
         <w:rPr>
@@ -3128,7 +3128,7 @@
         <w:rPr>
           <w:noProof/>
         </w:rPr>
-        <w:instrText xml:space="preserve"> PAGEREF _Toc242179636 \h </w:instrText>
+        <w:instrText xml:space="preserve"> PAGEREF _Toc242180267 \h </w:instrText>
       </w:r>
       <w:r>
         <w:rPr>
@@ -3201,7 +3201,7 @@
         <w:rPr>
           <w:noProof/>
         </w:rPr>
-        <w:instrText xml:space="preserve"> PAGEREF _Toc242179637 \h </w:instrText>
+        <w:instrText xml:space="preserve"> PAGEREF _Toc242180268 \h </w:instrText>
       </w:r>
       <w:r>
         <w:rPr>
@@ -3238,7 +3238,7 @@
         <w:lastRenderedPageBreak/>
         <w:fldChar w:fldCharType="end"/>
       </w:r>
-      <w:bookmarkStart w:id="0" w:name="_Toc242179599"/>
+      <w:bookmarkStart w:id="0" w:name="_Toc242180230"/>
       <w:r>
         <w:rPr>
           <w:rFonts w:hint="eastAsia"/>
@@ -3819,7 +3819,7 @@
           <w:rFonts w:hint="eastAsia"/>
         </w:rPr>
       </w:pPr>
-      <w:bookmarkStart w:id="1" w:name="_Toc242179600"/>
+      <w:bookmarkStart w:id="1" w:name="_Toc242180231"/>
       <w:r>
         <w:rPr>
           <w:rFonts w:hint="eastAsia"/>
@@ -4229,7 +4229,7 @@
           <w:rFonts w:hint="eastAsia"/>
         </w:rPr>
       </w:pPr>
-      <w:bookmarkStart w:id="2" w:name="_Toc242179601"/>
+      <w:bookmarkStart w:id="2" w:name="_Toc242180232"/>
       <w:r>
         <w:rPr>
           <w:rFonts w:hint="eastAsia"/>
@@ -4258,7 +4258,7 @@
           <w:rFonts w:hint="eastAsia"/>
         </w:rPr>
       </w:pPr>
-      <w:bookmarkStart w:id="3" w:name="_Toc242179602"/>
+      <w:bookmarkStart w:id="3" w:name="_Toc242180233"/>
       <w:r>
         <w:rPr>
           <w:rFonts w:hint="eastAsia"/>
@@ -5067,7 +5067,7 @@
           <w:rFonts w:hint="eastAsia"/>
         </w:rPr>
       </w:pPr>
-      <w:bookmarkStart w:id="4" w:name="_Toc242179603"/>
+      <w:bookmarkStart w:id="4" w:name="_Toc242180234"/>
       <w:r>
         <w:rPr>
           <w:rFonts w:hint="eastAsia"/>
@@ -5497,7 +5497,7 @@
           <w:rFonts w:hint="eastAsia"/>
         </w:rPr>
       </w:pPr>
-      <w:bookmarkStart w:id="5" w:name="_Toc242179604"/>
+      <w:bookmarkStart w:id="5" w:name="_Toc242180235"/>
       <w:r>
         <w:rPr>
           <w:rFonts w:hint="eastAsia"/>
@@ -6189,7 +6189,7 @@
           <w:rFonts w:hint="eastAsia"/>
         </w:rPr>
       </w:pPr>
-      <w:bookmarkStart w:id="6" w:name="_Toc242179605"/>
+      <w:bookmarkStart w:id="6" w:name="_Toc242180236"/>
       <w:r>
         <w:rPr>
           <w:rFonts w:hint="eastAsia"/>
@@ -6436,7 +6436,7 @@
           <w:rFonts w:hint="eastAsia"/>
         </w:rPr>
       </w:pPr>
-      <w:bookmarkStart w:id="7" w:name="_Toc242179606"/>
+      <w:bookmarkStart w:id="7" w:name="_Toc242180237"/>
       <w:r>
         <w:rPr>
           <w:rFonts w:hint="eastAsia"/>
@@ -6514,7 +6514,7 @@
           <w:rFonts w:hint="eastAsia"/>
         </w:rPr>
       </w:pPr>
-      <w:bookmarkStart w:id="8" w:name="_Toc242179607"/>
+      <w:bookmarkStart w:id="8" w:name="_Toc242180238"/>
       <w:r>
         <w:rPr>
           <w:rFonts w:hint="eastAsia"/>
@@ -6890,7 +6890,7 @@
           <w:rFonts w:hint="eastAsia"/>
         </w:rPr>
       </w:pPr>
-      <w:bookmarkStart w:id="9" w:name="_Toc242179608"/>
+      <w:bookmarkStart w:id="9" w:name="_Toc242180239"/>
       <w:r>
         <w:rPr>
           <w:rFonts w:hint="eastAsia"/>
@@ -7328,7 +7328,7 @@
           <w:rFonts w:hint="eastAsia"/>
         </w:rPr>
       </w:pPr>
-      <w:bookmarkStart w:id="10" w:name="_Toc242179609"/>
+      <w:bookmarkStart w:id="10" w:name="_Toc242180240"/>
       <w:r>
         <w:rPr>
           <w:rFonts w:hint="eastAsia"/>
@@ -7869,7 +7869,7 @@
           <w:rFonts w:hint="eastAsia"/>
         </w:rPr>
       </w:pPr>
-      <w:bookmarkStart w:id="11" w:name="_Toc242179610"/>
+      <w:bookmarkStart w:id="11" w:name="_Toc242180241"/>
       <w:r>
         <w:rPr>
           <w:rFonts w:hint="eastAsia"/>
@@ -8003,7 +8003,7 @@
         <w:rPr>
           <w:rFonts w:hint="eastAsia"/>
         </w:rPr>
-        <w:t>CVE-2019-8605</w:t>
+        <w:t>CVE-2021-30858</w:t>
       </w:r>
       <w:r>
         <w:rPr>
@@ -8015,7 +8015,7 @@
         <w:rPr>
           <w:rFonts w:hint="eastAsia"/>
         </w:rPr>
-        <w:t>CVE-2021-30858</w:t>
+        <w:t>CVE-2022-22620</w:t>
       </w:r>
       <w:r>
         <w:rPr>
@@ -8027,7 +8027,7 @@
         <w:rPr>
           <w:rFonts w:hint="eastAsia"/>
         </w:rPr>
-        <w:t xml:space="preserve">CVE-2022-22620 </w:t>
+        <w:t xml:space="preserve">CVE-2023-28205 </w:t>
       </w:r>
       <w:r>
         <w:rPr>
@@ -8081,31 +8081,79 @@
         <w:rPr>
           <w:rFonts w:hint="eastAsia"/>
         </w:rPr>
-        <w:t>收录，公开分析普遍归入逻辑</w:t>
-      </w:r>
-      <w:r>
-        <w:rPr>
-          <w:rFonts w:hint="eastAsia"/>
-        </w:rPr>
-        <w:t>/</w:t>
-      </w:r>
-      <w:r>
-        <w:rPr>
-          <w:rFonts w:hint="eastAsia"/>
-        </w:rPr>
-        <w:t>内存破坏类，其中生命周期错误（</w:t>
-      </w:r>
-      <w:r>
-        <w:rPr>
-          <w:rFonts w:hint="eastAsia"/>
-        </w:rPr>
-        <w:t>UAF</w:t>
-      </w:r>
-      <w:r>
-        <w:rPr>
-          <w:rFonts w:hint="eastAsia"/>
-        </w:rPr>
-        <w:t>）是这一时期的主流解释。</w:t>
+        <w:t>收录；需要说明的是，</w:t>
+      </w:r>
+      <w:r>
+        <w:rPr>
+          <w:rFonts w:hint="eastAsia"/>
+        </w:rPr>
+        <w:t xml:space="preserve">Apple </w:t>
+      </w:r>
+      <w:r>
+        <w:rPr>
+          <w:rFonts w:hint="eastAsia"/>
+        </w:rPr>
+        <w:t>通告并不逐条公布缺陷类别，公开分析（</w:t>
+      </w:r>
+      <w:r>
+        <w:rPr>
+          <w:rFonts w:hint="eastAsia"/>
+        </w:rPr>
+        <w:t xml:space="preserve">Project Zero </w:t>
+      </w:r>
+      <w:r>
+        <w:rPr>
+          <w:rFonts w:hint="eastAsia"/>
+        </w:rPr>
+        <w:t>等）多把这一时期的案例归入</w:t>
+      </w:r>
+      <w:r>
+        <w:rPr>
+          <w:rFonts w:hint="eastAsia"/>
+        </w:rPr>
+        <w:t xml:space="preserve"> UAF/</w:t>
+      </w:r>
+      <w:r>
+        <w:rPr>
+          <w:rFonts w:hint="eastAsia"/>
+        </w:rPr>
+        <w:t>生命周期错误，</w:t>
+      </w:r>
+      <w:r>
+        <w:rPr>
+          <w:rFonts w:hint="eastAsia"/>
+        </w:rPr>
+        <w:t xml:space="preserve">CVE-2019-8605 </w:t>
+      </w:r>
+      <w:r>
+        <w:rPr>
+          <w:rFonts w:hint="eastAsia"/>
+        </w:rPr>
+        <w:t>即属</w:t>
+      </w:r>
+      <w:r>
+        <w:rPr>
+          <w:rFonts w:hint="eastAsia"/>
+        </w:rPr>
+        <w:t>"</w:t>
+      </w:r>
+      <w:r>
+        <w:rPr>
+          <w:rFonts w:hint="eastAsia"/>
+        </w:rPr>
+        <w:t>通告未定性、公开分析归入内存破坏</w:t>
+      </w:r>
+      <w:r>
+        <w:rPr>
+          <w:rFonts w:hint="eastAsia"/>
+        </w:rPr>
+        <w:t>"</w:t>
+      </w:r>
+      <w:r>
+        <w:rPr>
+          <w:rFonts w:hint="eastAsia"/>
+        </w:rPr>
+        <w:t>的一例。</w:t>
       </w:r>
     </w:p>
     <w:p>
@@ -8347,7 +8395,7 @@
           <w:rFonts w:hint="eastAsia"/>
         </w:rPr>
       </w:pPr>
-      <w:bookmarkStart w:id="12" w:name="_Toc242179611"/>
+      <w:bookmarkStart w:id="12" w:name="_Toc242180242"/>
       <w:r>
         <w:rPr>
           <w:rFonts w:hint="eastAsia"/>
@@ -8669,11 +8717,12 @@
           <w:rFonts w:hint="eastAsia"/>
         </w:rPr>
       </w:pPr>
-      <w:bookmarkStart w:id="13" w:name="_Toc242179612"/>
-      <w:r>
-        <w:rPr>
-          <w:rFonts w:hint="eastAsia"/>
-        </w:rPr>
+      <w:bookmarkStart w:id="13" w:name="_Toc242180243"/>
+      <w:r>
+        <w:rPr>
+          <w:rFonts w:hint="eastAsia"/>
+        </w:rPr>
+        <w:lastRenderedPageBreak/>
         <w:t xml:space="preserve">3.6 </w:t>
       </w:r>
       <w:r>
@@ -8778,7 +8827,6 @@
                 <w:b/>
                 <w:sz w:val="18"/>
               </w:rPr>
-              <w:lastRenderedPageBreak/>
               <w:t>阶段</w:t>
             </w:r>
           </w:p>
@@ -9795,7 +9843,7 @@
           <w:rFonts w:hint="eastAsia"/>
         </w:rPr>
       </w:pPr>
-      <w:bookmarkStart w:id="14" w:name="_Toc242179613"/>
+      <w:bookmarkStart w:id="14" w:name="_Toc242180244"/>
       <w:r>
         <w:rPr>
           <w:rFonts w:hint="eastAsia"/>
@@ -10069,7 +10117,7 @@
           <w:rFonts w:hint="eastAsia"/>
         </w:rPr>
       </w:pPr>
-      <w:bookmarkStart w:id="15" w:name="_Toc242179614"/>
+      <w:bookmarkStart w:id="15" w:name="_Toc242180245"/>
       <w:r>
         <w:rPr>
           <w:rFonts w:hint="eastAsia"/>
@@ -10590,7 +10638,7 @@
           <w:rFonts w:hint="eastAsia"/>
         </w:rPr>
       </w:pPr>
-      <w:bookmarkStart w:id="16" w:name="_Toc242179615"/>
+      <w:bookmarkStart w:id="16" w:name="_Toc242180246"/>
       <w:r>
         <w:rPr>
           <w:rFonts w:hint="eastAsia"/>
@@ -10695,7 +10743,7 @@
           <w:rFonts w:hint="eastAsia"/>
         </w:rPr>
       </w:pPr>
-      <w:bookmarkStart w:id="17" w:name="_Toc242179616"/>
+      <w:bookmarkStart w:id="17" w:name="_Toc242180247"/>
       <w:r>
         <w:rPr>
           <w:rFonts w:hint="eastAsia"/>
@@ -10857,7 +10905,7 @@
           <w:rFonts w:hint="eastAsia"/>
         </w:rPr>
       </w:pPr>
-      <w:bookmarkStart w:id="18" w:name="_Toc242179617"/>
+      <w:bookmarkStart w:id="18" w:name="_Toc242180248"/>
       <w:r>
         <w:rPr>
           <w:rFonts w:hint="eastAsia"/>
@@ -11211,7 +11259,7 @@
                 <w:rFonts w:hint="eastAsia"/>
                 <w:sz w:val="18"/>
               </w:rPr>
-              <w:t>内存破坏</w:t>
+              <w:t>内存破坏（通告未逐条定性）</w:t>
             </w:r>
           </w:p>
         </w:tc>
@@ -11232,7 +11280,7 @@
                 <w:rFonts w:hint="eastAsia"/>
                 <w:sz w:val="18"/>
               </w:rPr>
-              <w:t>iOS 12.4</w:t>
+              <w:t>iOS 12.4.1</w:t>
             </w:r>
             <w:r>
               <w:rPr>
@@ -11253,7 +11301,21 @@
                 <w:rFonts w:hint="eastAsia"/>
                 <w:sz w:val="18"/>
               </w:rPr>
-              <w:t>紧急更新）</w:t>
+              <w:t>紧急更新，同批含</w:t>
+            </w:r>
+            <w:r>
+              <w:rPr>
+                <w:rFonts w:hint="eastAsia"/>
+                <w:sz w:val="18"/>
+              </w:rPr>
+              <w:t xml:space="preserve"> CVE-2019-8675</w:t>
+            </w:r>
+            <w:r>
+              <w:rPr>
+                <w:rFonts w:hint="eastAsia"/>
+                <w:sz w:val="18"/>
+              </w:rPr>
+              <w:t>）</w:t>
             </w:r>
           </w:p>
         </w:tc>
@@ -11274,7 +11336,21 @@
                 <w:rFonts w:hint="eastAsia"/>
                 <w:sz w:val="18"/>
               </w:rPr>
-              <w:t>水坑攻击链入口，配合内核提权形成完整链路</w:t>
+              <w:t>公开报道指向水坑式投递，配合提权形成完整链路；后被作为</w:t>
+            </w:r>
+            <w:r>
+              <w:rPr>
+                <w:rFonts w:hint="eastAsia"/>
+                <w:sz w:val="18"/>
+              </w:rPr>
+              <w:t xml:space="preserve"> N-day </w:t>
+            </w:r>
+            <w:r>
+              <w:rPr>
+                <w:rFonts w:hint="eastAsia"/>
+                <w:sz w:val="18"/>
+              </w:rPr>
+              <w:t>复用</w:t>
             </w:r>
           </w:p>
         </w:tc>
@@ -12884,7 +12960,7 @@
           <w:rFonts w:hint="eastAsia"/>
         </w:rPr>
       </w:pPr>
-      <w:bookmarkStart w:id="19" w:name="_Toc242179618"/>
+      <w:bookmarkStart w:id="19" w:name="_Toc242180249"/>
       <w:r>
         <w:rPr>
           <w:rFonts w:hint="eastAsia"/>
@@ -13404,7 +13480,7 @@
           <w:rFonts w:hint="eastAsia"/>
         </w:rPr>
       </w:pPr>
-      <w:bookmarkStart w:id="20" w:name="_Toc242179619"/>
+      <w:bookmarkStart w:id="20" w:name="_Toc242180250"/>
       <w:r>
         <w:rPr>
           <w:rFonts w:hint="eastAsia"/>
@@ -13482,7 +13558,7 @@
         <w:rPr>
           <w:rFonts w:hint="eastAsia"/>
         </w:rPr>
-        <w:t>iOS 12.4</w:t>
+        <w:t>iOS 12.4.1</w:t>
       </w:r>
       <w:r>
         <w:rPr>
@@ -13494,6 +13570,18 @@
         <w:rPr>
           <w:rFonts w:hint="eastAsia"/>
         </w:rPr>
+        <w:t>14.8</w:t>
+      </w:r>
+      <w:r>
+        <w:rPr>
+          <w:rFonts w:hint="eastAsia"/>
+        </w:rPr>
+        <w:t>、</w:t>
+      </w:r>
+      <w:r>
+        <w:rPr>
+          <w:rFonts w:hint="eastAsia"/>
+        </w:rPr>
         <w:t>15.3.1</w:t>
       </w:r>
       <w:r>
@@ -13531,6 +13619,18 @@
           <w:rFonts w:hint="eastAsia"/>
         </w:rPr>
         <w:t>17.4</w:t>
+      </w:r>
+      <w:r>
+        <w:rPr>
+          <w:rFonts w:hint="eastAsia"/>
+        </w:rPr>
+        <w:t>、</w:t>
+      </w:r>
+      <w:r>
+        <w:rPr>
+          <w:rFonts w:hint="eastAsia"/>
+        </w:rPr>
+        <w:t>18.1.1</w:t>
       </w:r>
       <w:r>
         <w:rPr>
@@ -13753,7 +13853,7 @@
           <w:rFonts w:hint="eastAsia"/>
         </w:rPr>
       </w:pPr>
-      <w:bookmarkStart w:id="21" w:name="_Toc242179620"/>
+      <w:bookmarkStart w:id="21" w:name="_Toc242180251"/>
       <w:r>
         <w:rPr>
           <w:rFonts w:hint="eastAsia"/>
@@ -13770,7 +13870,7 @@
           <w:rFonts w:hint="eastAsia"/>
         </w:rPr>
       </w:pPr>
-      <w:bookmarkStart w:id="22" w:name="_Toc242179621"/>
+      <w:bookmarkStart w:id="22" w:name="_Toc242180252"/>
       <w:r>
         <w:rPr>
           <w:rFonts w:hint="eastAsia"/>
@@ -14041,7 +14141,7 @@
           <w:rFonts w:hint="eastAsia"/>
         </w:rPr>
       </w:pPr>
-      <w:bookmarkStart w:id="23" w:name="_Toc242179622"/>
+      <w:bookmarkStart w:id="23" w:name="_Toc242180253"/>
       <w:r>
         <w:rPr>
           <w:rFonts w:hint="eastAsia"/>
@@ -14203,7 +14303,7 @@
           <w:rFonts w:hint="eastAsia"/>
         </w:rPr>
       </w:pPr>
-      <w:bookmarkStart w:id="24" w:name="_Toc242179623"/>
+      <w:bookmarkStart w:id="24" w:name="_Toc242180254"/>
       <w:r>
         <w:rPr>
           <w:rFonts w:hint="eastAsia"/>
@@ -14563,7 +14663,7 @@
           <w:rFonts w:hint="eastAsia"/>
         </w:rPr>
       </w:pPr>
-      <w:bookmarkStart w:id="25" w:name="_Toc242179624"/>
+      <w:bookmarkStart w:id="25" w:name="_Toc242180255"/>
       <w:r>
         <w:rPr>
           <w:rFonts w:hint="eastAsia"/>
@@ -14580,7 +14680,7 @@
           <w:rFonts w:hint="eastAsia"/>
         </w:rPr>
       </w:pPr>
-      <w:bookmarkStart w:id="26" w:name="_Toc242179625"/>
+      <w:bookmarkStart w:id="26" w:name="_Toc242180256"/>
       <w:r>
         <w:rPr>
           <w:rFonts w:hint="eastAsia"/>
@@ -15864,7 +15964,7 @@
           <w:rFonts w:hint="eastAsia"/>
         </w:rPr>
       </w:pPr>
-      <w:bookmarkStart w:id="27" w:name="_Toc242179626"/>
+      <w:bookmarkStart w:id="27" w:name="_Toc242180257"/>
       <w:r>
         <w:rPr>
           <w:rFonts w:hint="eastAsia"/>
@@ -16125,7 +16225,7 @@
           <w:rFonts w:hint="eastAsia"/>
         </w:rPr>
       </w:pPr>
-      <w:bookmarkStart w:id="28" w:name="_Toc242179627"/>
+      <w:bookmarkStart w:id="28" w:name="_Toc242180258"/>
       <w:r>
         <w:rPr>
           <w:rFonts w:hint="eastAsia"/>
@@ -16312,7 +16412,7 @@
           <w:rFonts w:hint="eastAsia"/>
         </w:rPr>
       </w:pPr>
-      <w:bookmarkStart w:id="29" w:name="_Toc242179628"/>
+      <w:bookmarkStart w:id="29" w:name="_Toc242180259"/>
       <w:r>
         <w:rPr>
           <w:rFonts w:hint="eastAsia"/>
@@ -16329,7 +16429,7 @@
           <w:rFonts w:hint="eastAsia"/>
         </w:rPr>
       </w:pPr>
-      <w:bookmarkStart w:id="30" w:name="_Toc242179629"/>
+      <w:bookmarkStart w:id="30" w:name="_Toc242180260"/>
       <w:r>
         <w:rPr>
           <w:rFonts w:hint="eastAsia"/>
@@ -16670,7 +16770,7 @@
           <w:rFonts w:hint="eastAsia"/>
         </w:rPr>
       </w:pPr>
-      <w:bookmarkStart w:id="31" w:name="_Toc242179630"/>
+      <w:bookmarkStart w:id="31" w:name="_Toc242180261"/>
       <w:r>
         <w:rPr>
           <w:rFonts w:hint="eastAsia"/>
@@ -17153,7 +17253,7 @@
           <w:rFonts w:hint="eastAsia"/>
         </w:rPr>
       </w:pPr>
-      <w:bookmarkStart w:id="32" w:name="_Toc242179631"/>
+      <w:bookmarkStart w:id="32" w:name="_Toc242180262"/>
       <w:r>
         <w:rPr>
           <w:rFonts w:hint="eastAsia"/>
@@ -17308,7 +17408,7 @@
           <w:rFonts w:hint="eastAsia"/>
         </w:rPr>
       </w:pPr>
-      <w:bookmarkStart w:id="33" w:name="_Toc242179632"/>
+      <w:bookmarkStart w:id="33" w:name="_Toc242180263"/>
       <w:r>
         <w:rPr>
           <w:rFonts w:hint="eastAsia"/>
@@ -18007,7 +18107,7 @@
           <w:rFonts w:hint="eastAsia"/>
         </w:rPr>
       </w:pPr>
-      <w:bookmarkStart w:id="34" w:name="_Toc242179633"/>
+      <w:bookmarkStart w:id="34" w:name="_Toc242180264"/>
       <w:r>
         <w:rPr>
           <w:rFonts w:hint="eastAsia"/>
@@ -18456,7 +18556,7 @@
           <w:rFonts w:hint="eastAsia"/>
         </w:rPr>
       </w:pPr>
-      <w:bookmarkStart w:id="35" w:name="_Toc242179634"/>
+      <w:bookmarkStart w:id="35" w:name="_Toc242180265"/>
       <w:r>
         <w:rPr>
           <w:rFonts w:hint="eastAsia"/>
@@ -18473,7 +18573,7 @@
           <w:rFonts w:hint="eastAsia"/>
         </w:rPr>
       </w:pPr>
-      <w:bookmarkStart w:id="36" w:name="_Toc242179635"/>
+      <w:bookmarkStart w:id="36" w:name="_Toc242180266"/>
       <w:r>
         <w:rPr>
           <w:rFonts w:hint="eastAsia"/>
@@ -19875,7 +19975,7 @@
           <w:rFonts w:hint="eastAsia"/>
         </w:rPr>
       </w:pPr>
-      <w:bookmarkStart w:id="37" w:name="_Toc242179636"/>
+      <w:bookmarkStart w:id="37" w:name="_Toc242180267"/>
       <w:r>
         <w:rPr>
           <w:rFonts w:hint="eastAsia"/>
@@ -20351,7 +20451,7 @@
           <w:rFonts w:hint="eastAsia"/>
         </w:rPr>
       </w:pPr>
-      <w:bookmarkStart w:id="38" w:name="_Toc242179637"/>
+      <w:bookmarkStart w:id="38" w:name="_Toc242180268"/>
       <w:r>
         <w:rPr>
           <w:rFonts w:hint="eastAsia"/>

</xml_diff>